<commit_message>
SystemDesign: MS DataPatterns added
</commit_message>
<xml_diff>
--- a/Microservices/Microservices_DesignPatterns.docx
+++ b/Microservices/Microservices_DesignPatterns.docx
@@ -1545,7 +1545,674 @@
           <w:i w:val="false"/>
           <w:iCs w:val="false"/>
         </w:rPr>
-        <w:t>Edge =&gt; Isolation of clients is critical to prevent exposing your entire system to the world and for preventing clients from calling unapproved APIs. With Oauth, we can provide good security on Edge services.</w:t>
+        <w:t>Edge =&gt; Isolation of clients is critical to prevent exposing your entire system to the world and for preventing clients from calling unapproved APIs. With O</w:t>
+      </w:r>
+      <w:r>
+        <w:rPr>
+          <w:i w:val="false"/>
+          <w:iCs w:val="false"/>
+        </w:rPr>
+        <w:t>A</w:t>
+      </w:r>
+      <w:r>
+        <w:rPr>
+          <w:i w:val="false"/>
+          <w:iCs w:val="false"/>
+        </w:rPr>
+        <w:t xml:space="preserve">uth, we can provide good security on Edge services. </w:t>
+      </w:r>
+    </w:p>
+    <w:p>
+      <w:pPr>
+        <w:pStyle w:val="Normal"/>
+        <w:bidi w:val="0"/>
+        <w:jc w:val="start"/>
+        <w:rPr>
+          <w:i w:val="false"/>
+          <w:iCs w:val="false"/>
+        </w:rPr>
+      </w:pPr>
+      <w:r>
+        <w:rPr>
+          <w:i w:val="false"/>
+          <w:iCs w:val="false"/>
+        </w:rPr>
+      </w:r>
+    </w:p>
+    <w:p>
+      <w:pPr>
+        <w:pStyle w:val="Normal"/>
+        <w:bidi w:val="0"/>
+        <w:jc w:val="start"/>
+        <w:rPr>
+          <w:i w:val="false"/>
+          <w:iCs w:val="false"/>
+        </w:rPr>
+      </w:pPr>
+      <w:r>
+        <w:rPr>
+          <w:i w:val="false"/>
+          <w:iCs w:val="false"/>
+        </w:rPr>
+      </w:r>
+    </w:p>
+    <w:p>
+      <w:pPr>
+        <w:pStyle w:val="Normal"/>
+        <w:bidi w:val="0"/>
+        <w:jc w:val="start"/>
+        <w:rPr>
+          <w:i w:val="false"/>
+          <w:iCs w:val="false"/>
+          <w:u w:val="single"/>
+        </w:rPr>
+      </w:pPr>
+      <w:r>
+        <w:rPr>
+          <w:i w:val="false"/>
+          <w:iCs w:val="false"/>
+          <w:u w:val="single"/>
+        </w:rPr>
+        <w:t>Data patterns:</w:t>
+      </w:r>
+    </w:p>
+    <w:p>
+      <w:pPr>
+        <w:pStyle w:val="Normal"/>
+        <w:bidi w:val="0"/>
+        <w:jc w:val="start"/>
+        <w:rPr>
+          <w:i/>
+          <w:iCs/>
+        </w:rPr>
+      </w:pPr>
+      <w:r>
+        <w:rPr>
+          <w:i/>
+          <w:iCs/>
+        </w:rPr>
+        <w:t>Single service database:</w:t>
+      </w:r>
+    </w:p>
+    <w:p>
+      <w:pPr>
+        <w:pStyle w:val="Normal"/>
+        <w:bidi w:val="0"/>
+        <w:jc w:val="start"/>
+        <w:rPr>
+          <w:i w:val="false"/>
+          <w:iCs w:val="false"/>
+        </w:rPr>
+      </w:pPr>
+      <w:r>
+        <w:rPr>
+          <w:i w:val="false"/>
+          <w:iCs w:val="false"/>
+        </w:rPr>
+        <w:t>most common pattern: single-service single-database patterns for all data-domain based services.</w:t>
+      </w:r>
+    </w:p>
+    <w:p>
+      <w:pPr>
+        <w:pStyle w:val="Normal"/>
+        <w:bidi w:val="0"/>
+        <w:jc w:val="start"/>
+        <w:rPr>
+          <w:i w:val="false"/>
+          <w:iCs w:val="false"/>
+        </w:rPr>
+      </w:pPr>
+      <w:r>
+        <w:rPr>
+          <w:i w:val="false"/>
+          <w:iCs w:val="false"/>
+        </w:rPr>
+        <w:t>Problem we are solving with this pattern is Scalability</w:t>
+      </w:r>
+    </w:p>
+    <w:p>
+      <w:pPr>
+        <w:pStyle w:val="Normal"/>
+        <w:bidi w:val="0"/>
+        <w:jc w:val="start"/>
+        <w:rPr>
+          <w:i w:val="false"/>
+          <w:iCs w:val="false"/>
+        </w:rPr>
+      </w:pPr>
+      <w:r>
+        <w:rPr>
+          <w:i w:val="false"/>
+          <w:iCs w:val="false"/>
+        </w:rPr>
+        <w:t>Scalability ‘requirements’ between database and service are related. Service scalability requirements/needs should be proportional to database’s scaling requirements/needs.</w:t>
+      </w:r>
+    </w:p>
+    <w:p>
+      <w:pPr>
+        <w:pStyle w:val="Normal"/>
+        <w:bidi w:val="0"/>
+        <w:jc w:val="start"/>
+        <w:rPr>
+          <w:i w:val="false"/>
+          <w:iCs w:val="false"/>
+        </w:rPr>
+      </w:pPr>
+      <w:r>
+        <w:rPr>
+          <w:i w:val="false"/>
+          <w:iCs w:val="false"/>
+        </w:rPr>
+        <w:t xml:space="preserve">As load on single service increases, the associated use of the database will also increase. In turn, this can cause to increase/size the database based on single-service peak needs when the entire system is underutilized. In this pattern, </w:t>
+      </w:r>
+      <w:r>
+        <w:rPr>
+          <w:i/>
+          <w:iCs/>
+        </w:rPr>
+        <w:t>each data domain</w:t>
+      </w:r>
+      <w:r>
+        <w:rPr>
+          <w:i w:val="false"/>
+          <w:iCs w:val="false"/>
+        </w:rPr>
+        <w:t xml:space="preserve"> gets its </w:t>
+      </w:r>
+      <w:r>
+        <w:rPr>
+          <w:i/>
+          <w:iCs/>
+        </w:rPr>
+        <w:t>own dedicated datastore</w:t>
+      </w:r>
+      <w:r>
+        <w:rPr>
+          <w:i w:val="false"/>
+          <w:iCs w:val="false"/>
+        </w:rPr>
+        <w:t>. As your service scales in this pattern, your datastore also scales, which is another key benefit of this pattern. Since the data domain is isolated and the datastore itself is also isolated, you can scale both of them up or down without affecting the entire system. We start with a single service and its single datastore. We will add two more services, each of which has its own database. Lets say we scale Service1 independently of anything else adding more instances. This causes increased load on the database so we need to scale it as well.</w:t>
+      </w:r>
+    </w:p>
+    <w:p>
+      <w:pPr>
+        <w:pStyle w:val="Normal"/>
+        <w:bidi w:val="0"/>
+        <w:jc w:val="start"/>
+        <w:rPr>
+          <w:i w:val="false"/>
+          <w:iCs w:val="false"/>
+        </w:rPr>
+      </w:pPr>
+      <w:r>
+        <w:rPr>
+          <w:i w:val="false"/>
+          <w:iCs w:val="false"/>
+        </w:rPr>
+      </w:r>
+    </w:p>
+    <w:p>
+      <w:pPr>
+        <w:pStyle w:val="Normal"/>
+        <w:bidi w:val="0"/>
+        <w:jc w:val="start"/>
+        <w:rPr>
+          <w:i/>
+          <w:iCs/>
+        </w:rPr>
+      </w:pPr>
+      <w:r>
+        <w:rPr>
+          <w:i/>
+          <w:iCs/>
+        </w:rPr>
+        <w:t>Shared database pattern:</w:t>
+      </w:r>
+    </w:p>
+    <w:p>
+      <w:pPr>
+        <w:pStyle w:val="Normal"/>
+        <w:bidi w:val="0"/>
+        <w:jc w:val="start"/>
+        <w:rPr>
+          <w:i w:val="false"/>
+          <w:iCs w:val="false"/>
+        </w:rPr>
+      </w:pPr>
+      <w:r>
+        <w:rPr>
+          <w:i w:val="false"/>
+          <w:iCs w:val="false"/>
+        </w:rPr>
+        <w:t xml:space="preserve">Single-service, Single-database is usually an effective one, sometimes you must use a </w:t>
+      </w:r>
+      <w:r>
+        <w:rPr>
+          <w:i w:val="false"/>
+          <w:iCs w:val="false"/>
+          <w:u w:val="single"/>
+        </w:rPr>
+        <w:t>shared database.</w:t>
+      </w:r>
+      <w:r>
+        <w:rPr>
+          <w:i w:val="false"/>
+          <w:iCs w:val="false"/>
+          <w:u w:val="none"/>
+        </w:rPr>
+        <w:t xml:space="preserve"> The given here is, all data domains exist within a single database instance. Data distribution should be handled by the database itself. If you are deploying to multiple data-centers, you need the database to handle the data synchronization across the data-centers themselves. We want to write code with a single database isolation model, even if the database is shared. We can isolate using schemas and each service that consumes that schema should have unique credentials. Works well for startups also. Data domains should connect to a single schema within a shared database. By having this pattern in place, we can better breakup database up later because the data and the apps are already logically isolated, even if the database is shared.</w:t>
+      </w:r>
+    </w:p>
+    <w:p>
+      <w:pPr>
+        <w:pStyle w:val="Normal"/>
+        <w:bidi w:val="0"/>
+        <w:jc w:val="start"/>
+        <w:rPr>
+          <w:i w:val="false"/>
+          <w:iCs w:val="false"/>
+        </w:rPr>
+      </w:pPr>
+      <w:r>
+        <w:rPr>
+          <w:i w:val="false"/>
+          <w:iCs w:val="false"/>
+          <w:u w:val="none"/>
+        </w:rPr>
+      </w:r>
+    </w:p>
+    <w:p>
+      <w:pPr>
+        <w:pStyle w:val="Normal"/>
+        <w:bidi w:val="0"/>
+        <w:jc w:val="start"/>
+        <w:rPr>
+          <w:i w:val="false"/>
+          <w:iCs w:val="false"/>
+        </w:rPr>
+      </w:pPr>
+      <w:r>
+        <w:rPr>
+          <w:i w:val="false"/>
+          <w:iCs w:val="false"/>
+          <w:u w:val="none"/>
+        </w:rPr>
+      </w:r>
+    </w:p>
+    <w:p>
+      <w:pPr>
+        <w:pStyle w:val="Normal"/>
+        <w:bidi w:val="0"/>
+        <w:jc w:val="start"/>
+        <w:rPr>
+          <w:i/>
+          <w:iCs/>
+          <w:u w:val="none"/>
+        </w:rPr>
+      </w:pPr>
+      <w:r>
+        <w:rPr>
+          <w:i/>
+          <w:iCs/>
+          <w:u w:val="none"/>
+        </w:rPr>
+        <w:t>Command Query Responsibility Segregation (CQRS):</w:t>
+      </w:r>
+    </w:p>
+    <w:p>
+      <w:pPr>
+        <w:pStyle w:val="Normal"/>
+        <w:bidi w:val="0"/>
+        <w:jc w:val="start"/>
+        <w:rPr>
+          <w:i w:val="false"/>
+          <w:iCs w:val="false"/>
+        </w:rPr>
+      </w:pPr>
+      <w:r>
+        <w:rPr>
+          <w:i w:val="false"/>
+          <w:iCs w:val="false"/>
+          <w:u w:val="none"/>
+        </w:rPr>
+        <w:t>CQRS pattern is complex of all. The core pattern we are trying to solve is that our data access patterns diverge from traditional CRUD to more complex multi-model patterns. Command Query Responsibility Segregation (CQRS) means: separating read operations from write operations. In advanced CQRS, commands update the write model and publish events, which are then used to update the read model asynchronously. Multi-model pattern within a single bounded context or data domain. Looks like Read operations and Write operations have different set of rules and the underlying data becomes the same due to eventual consistency. In CRUD, a model has a unified set of rules for both reading and writing. CQRS is a divergence from CRUD when it comes to reading and writing. It dramatically increases complexity of the system. You must accept that you cannot fully read data, which was written fresh due to eventual consistency. Task-based UI operations in CQRS mean designing UI actions based on user tasks (business actions), not generic CRUD operations.</w:t>
+      </w:r>
+    </w:p>
+    <w:p>
+      <w:pPr>
+        <w:pStyle w:val="Normal"/>
+        <w:bidi w:val="0"/>
+        <w:jc w:val="start"/>
+        <w:rPr>
+          <w:i w:val="false"/>
+          <w:iCs w:val="false"/>
+        </w:rPr>
+      </w:pPr>
+      <w:r>
+        <w:rPr>
+          <w:i w:val="false"/>
+          <w:iCs w:val="false"/>
+          <w:u w:val="none"/>
+        </w:rPr>
+        <w:t>Example</w:t>
+        <w:br/>
+        <w:t>❌ CRUD-style UI</w:t>
+        <w:br/>
+        <w:t>Edit Order</w:t>
+        <w:br/>
+        <w:t>Update Status</w:t>
+        <w:br/>
+        <w:t>Change Address</w:t>
+        <w:br/>
+        <w:t>👉 Very technical, database-focused</w:t>
+        <w:br/>
+        <w:br/>
+        <w:t>✅ Task-based UI</w:t>
+        <w:br/>
+        <w:t>Place Order</w:t>
+        <w:br/>
+        <w:t>Cancel Order</w:t>
+        <w:br/>
+        <w:t>Approve Order</w:t>
+        <w:br/>
+        <w:t>Ship Order</w:t>
+        <w:br/>
+        <w:t>👉 Business-focused actions</w:t>
+      </w:r>
+    </w:p>
+    <w:p>
+      <w:pPr>
+        <w:pStyle w:val="Normal"/>
+        <w:bidi w:val="0"/>
+        <w:jc w:val="start"/>
+        <w:rPr>
+          <w:i w:val="false"/>
+          <w:iCs w:val="false"/>
+        </w:rPr>
+      </w:pPr>
+      <w:r>
+        <w:rPr>
+          <w:i w:val="false"/>
+          <w:iCs w:val="false"/>
+          <w:u w:val="none"/>
+        </w:rPr>
+        <w:t xml:space="preserve"> </w:t>
+      </w:r>
+    </w:p>
+    <w:p>
+      <w:pPr>
+        <w:pStyle w:val="Normal"/>
+        <w:bidi w:val="0"/>
+        <w:jc w:val="start"/>
+        <w:rPr>
+          <w:i w:val="false"/>
+          <w:iCs w:val="false"/>
+        </w:rPr>
+      </w:pPr>
+      <w:r>
+        <w:rPr>
+          <w:i w:val="false"/>
+          <w:iCs w:val="false"/>
+          <w:u w:val="none"/>
+        </w:rPr>
+        <w:t>Think of a banking app:</w:t>
+        <w:br/>
+        <w:t>❌ CRUD UI</w:t>
+        <w:br/>
+        <w:t>Update account balance</w:t>
+        <w:br/>
+        <w:t>Modify transaction</w:t>
+      </w:r>
+    </w:p>
+    <w:p>
+      <w:pPr>
+        <w:pStyle w:val="Normal"/>
+        <w:bidi w:val="0"/>
+        <w:jc w:val="start"/>
+        <w:rPr>
+          <w:i w:val="false"/>
+          <w:iCs w:val="false"/>
+        </w:rPr>
+      </w:pPr>
+      <w:r>
+        <w:rPr>
+          <w:i w:val="false"/>
+          <w:iCs w:val="false"/>
+          <w:u w:val="none"/>
+        </w:rPr>
+      </w:r>
+    </w:p>
+    <w:p>
+      <w:pPr>
+        <w:pStyle w:val="Normal"/>
+        <w:bidi w:val="0"/>
+        <w:jc w:val="start"/>
+        <w:rPr>
+          <w:i w:val="false"/>
+          <w:iCs w:val="false"/>
+        </w:rPr>
+      </w:pPr>
+      <w:r>
+        <w:rPr>
+          <w:i w:val="false"/>
+          <w:iCs w:val="false"/>
+          <w:u w:val="none"/>
+        </w:rPr>
+        <w:t xml:space="preserve">✅ </w:t>
+      </w:r>
+      <w:r>
+        <w:rPr>
+          <w:i w:val="false"/>
+          <w:iCs w:val="false"/>
+          <w:u w:val="none"/>
+        </w:rPr>
+        <w:t>Task-based UI</w:t>
+        <w:br/>
+        <w:t>Transfer money</w:t>
+        <w:br/>
+        <w:t>Withdraw cash</w:t>
+        <w:br/>
+        <w:t>Deposit money</w:t>
+        <w:br/>
+        <w:t>👉 These are tasks, not database operations</w:t>
+      </w:r>
+    </w:p>
+    <w:p>
+      <w:pPr>
+        <w:pStyle w:val="Normal"/>
+        <w:bidi w:val="0"/>
+        <w:jc w:val="start"/>
+        <w:rPr>
+          <w:i w:val="false"/>
+          <w:iCs w:val="false"/>
+        </w:rPr>
+      </w:pPr>
+      <w:r>
+        <w:rPr>
+          <w:i w:val="false"/>
+          <w:iCs w:val="false"/>
+          <w:u w:val="none"/>
+        </w:rPr>
+        <w:t>CRUD-UI is DB centric, Task-UI is business-centric</w:t>
+      </w:r>
+    </w:p>
+    <w:p>
+      <w:pPr>
+        <w:pStyle w:val="Normal"/>
+        <w:bidi w:val="0"/>
+        <w:jc w:val="start"/>
+        <w:rPr>
+          <w:i w:val="false"/>
+          <w:iCs w:val="false"/>
+        </w:rPr>
+      </w:pPr>
+      <w:r>
+        <w:rPr>
+          <w:i w:val="false"/>
+          <w:iCs w:val="false"/>
+          <w:u w:val="none"/>
+        </w:rPr>
+      </w:r>
+    </w:p>
+    <w:p>
+      <w:pPr>
+        <w:pStyle w:val="Normal"/>
+        <w:bidi w:val="0"/>
+        <w:jc w:val="start"/>
+        <w:rPr>
+          <w:i w:val="false"/>
+          <w:iCs w:val="false"/>
+        </w:rPr>
+      </w:pPr>
+      <w:r>
+        <w:rPr>
+          <w:i w:val="false"/>
+          <w:iCs w:val="false"/>
+          <w:u w:val="none"/>
+        </w:rPr>
+      </w:r>
+    </w:p>
+    <w:p>
+      <w:pPr>
+        <w:pStyle w:val="Normal"/>
+        <w:bidi w:val="0"/>
+        <w:jc w:val="start"/>
+        <w:rPr>
+          <w:i w:val="false"/>
+          <w:iCs w:val="false"/>
+        </w:rPr>
+      </w:pPr>
+      <w:r>
+        <w:rPr>
+          <w:i w:val="false"/>
+          <w:iCs w:val="false"/>
+          <w:u w:val="none"/>
+        </w:rPr>
+      </w:r>
+    </w:p>
+    <w:p>
+      <w:pPr>
+        <w:pStyle w:val="Normal"/>
+        <w:bidi w:val="0"/>
+        <w:jc w:val="start"/>
+        <w:rPr>
+          <w:i/>
+          <w:iCs/>
+        </w:rPr>
+      </w:pPr>
+      <w:r>
+        <w:rPr>
+          <w:i/>
+          <w:iCs/>
+        </w:rPr>
+        <w:t>Asynchronous eventing:</w:t>
+      </w:r>
+    </w:p>
+    <w:p>
+      <w:pPr>
+        <w:pStyle w:val="Normal"/>
+        <w:bidi w:val="0"/>
+        <w:jc w:val="start"/>
+        <w:rPr>
+          <w:i w:val="false"/>
+          <w:iCs w:val="false"/>
+        </w:rPr>
+      </w:pPr>
+      <w:r>
+        <w:rPr>
+          <w:i w:val="false"/>
+          <w:iCs w:val="false"/>
+        </w:rPr>
+        <w:t xml:space="preserve">In microservices architecture, we run into situation where long-running transactions or complex workflows cannot fit into a single blocking API call. Asynchronous eventing describes a set of problems that cannot be done in real-time through a blocking call. The pattern depends upon the use cases, a service API triggers an event and that event can cascade asynchronously from the API itself, putting together a series of actions that all happen behind the scenes, after the client has received an accepted message from the service API. You can make a single blocking call (A blocking call is a call that makes the program wait until it finishes before doing anything else.) and put a message on a messaging system. Once that’s done, the service returns and then behind the scenes processing occurs in an asynchronous manner. </w:t>
+      </w:r>
+    </w:p>
+    <w:p>
+      <w:pPr>
+        <w:pStyle w:val="Normal"/>
+        <w:bidi w:val="0"/>
+        <w:jc w:val="start"/>
+        <w:rPr>
+          <w:i w:val="false"/>
+          <w:iCs w:val="false"/>
+        </w:rPr>
+      </w:pPr>
+      <w:r>
+        <w:rPr>
+          <w:i w:val="false"/>
+          <w:iCs w:val="false"/>
+        </w:rPr>
+      </w:r>
+    </w:p>
+    <w:p>
+      <w:pPr>
+        <w:pStyle w:val="Normal"/>
+        <w:bidi w:val="0"/>
+        <w:jc w:val="start"/>
+        <w:rPr>
+          <w:i w:val="false"/>
+          <w:iCs w:val="false"/>
+        </w:rPr>
+      </w:pPr>
+      <w:r>
+        <w:rPr>
+          <w:i w:val="false"/>
+          <w:iCs w:val="false"/>
+        </w:rPr>
+      </w:r>
+    </w:p>
+    <w:p>
+      <w:pPr>
+        <w:pStyle w:val="Normal"/>
+        <w:bidi w:val="0"/>
+        <w:jc w:val="start"/>
+        <w:rPr>
+          <w:i w:val="false"/>
+          <w:iCs w:val="false"/>
+        </w:rPr>
+      </w:pPr>
+      <w:r>
+        <w:rPr>
+          <w:i w:val="false"/>
+          <w:iCs w:val="false"/>
+        </w:rPr>
+      </w:r>
+    </w:p>
+    <w:p>
+      <w:pPr>
+        <w:pStyle w:val="Normal"/>
+        <w:bidi w:val="0"/>
+        <w:jc w:val="start"/>
+        <w:rPr>
+          <w:i w:val="false"/>
+          <w:iCs w:val="false"/>
+          <w:u w:val="single"/>
+        </w:rPr>
+      </w:pPr>
+      <w:r>
+        <w:rPr>
+          <w:i w:val="false"/>
+          <w:iCs w:val="false"/>
+          <w:u w:val="single"/>
+        </w:rPr>
+        <w:t>Operational Patterns:</w:t>
+      </w:r>
+    </w:p>
+    <w:p>
+      <w:pPr>
+        <w:pStyle w:val="Normal"/>
+        <w:bidi w:val="0"/>
+        <w:jc w:val="start"/>
+        <w:rPr>
+          <w:i/>
+          <w:iCs/>
+        </w:rPr>
+      </w:pPr>
+      <w:r>
+        <w:rPr>
+          <w:i/>
+          <w:iCs/>
+        </w:rPr>
+        <w:t>Log aggregation patterns:</w:t>
       </w:r>
     </w:p>
     <w:p>

</xml_diff>

<commit_message>
SystemDesign: Microservices DesignPatterns done
</commit_message>
<xml_diff>
--- a/Microservices/Microservices_DesignPatterns.docx
+++ b/Microservices/Microservices_DesignPatterns.docx
@@ -2327,14 +2327,7 @@
           <w:i w:val="false"/>
           <w:iCs w:val="false"/>
         </w:rPr>
-        <w:t xml:space="preserve"> the errors </w:t>
-      </w:r>
-      <w:r>
-        <w:rPr>
-          <w:i w:val="false"/>
-          <w:iCs w:val="false"/>
-        </w:rPr>
-        <w:t xml:space="preserve">and LOGS are a single best place to look for. Logs provide detailed information on the runtime behavior of your microservice artifact. Logs can be written and linked to other system logs as well. As such, logging needs to be consistent across all services. That means, when we do log aggregation and indexing, consistency not only within a single service, but also across the entire system becomes critical. The structure and format of the logs therefore must be consistent and enforced across entire system. Polyglot programming can make this difficult, the time spent making your log output consistent will be well worth it. Domain-level taxonomy (Taxonomy in software logs is a structured, hierarchical classification system used to normalize and categorize raw log data into understandable, consistent formats) and logs should be shared across every consumer and related service. Identifiers and core values across your log messages should be keyed the same as well as documented. Log aggregation is the key pattern in the operations of microservices-based system. In monolithic models, log messages usually all go to the same output. With microservices, logs are distributed everywhere, each service writes its own logs and dumps them into output of some kind. The output locations of logs from services are usually unique per service and difficult to find and follow in a stateless flow. Log aggregation is a way to aggregate various output locations into a single stream of data. This aggregation takes on many forms and in the end all logs end up in one place. Logs usually have tags (metadata) attached to the messages themselves, the more structured the logs are, the less parsing you got to do to streamline. The reality is, faster they can be aggregated, the faster they can be indexed then you can actually use that log data to diagnose issues. Make sure, tracing identifiers are injected into the logs in the exact same way across every service with the same key so they can be traced and call stacks of errant processes could be recreated. Structured logging frameworks exist and almost every language has them. </w:t>
+        <w:t xml:space="preserve"> the errors and LOGS are a single best place to look for. Logs provide detailed information on the runtime behavior of your microservice artifact. Logs can be written and linked to other system logs as well. As such, logging needs to be consistent across all services. That means, when we do log aggregation and indexing, consistency not only within a single service, but also across the entire system becomes critical. The structure and format of the logs therefore must be consistent and enforced across entire system. Polyglot programming can make this difficult, the time spent making your log output consistent will be well worth it. Domain-level taxonomy (Taxonomy in software logs is a structured, hierarchical classification system used to normalize and categorize raw log data into understandable, consistent formats) and logs should be shared across every consumer and related service. Identifiers and core values across your log messages should be keyed the same as well as documented. Log aggregation is the key pattern in the operations of microservices-based system. In monolithic models, log messages usually all go to the same output. With microservices, logs are distributed everywhere, each service writes its own logs and dumps them into output of some kind. The output locations of logs from services are usually unique per service and difficult to find and follow in a stateless flow. Log aggregation is a way to aggregate various output locations into a single stream of data. This aggregation takes on many forms and in the end all logs end up in one place. Logs usually have tags (metadata) attached to the messages themselves, the more structured the logs are, the less parsing you got to do to streamline. The reality is, faster they can be aggregated, the faster they can be indexed then you can actually use that log data to diagnose issues. Make sure, tracing identifiers are injected into the logs in the exact same way across every service with the same key so they can be traced and call stacks of errant processes could be recreated. Structured logging frameworks exist and almost every language has them. </w:t>
       </w:r>
     </w:p>
     <w:p>
@@ -3182,6 +3175,757 @@
           <w:i w:val="false"/>
           <w:iCs w:val="false"/>
         </w:rPr>
+        <w:t xml:space="preserve">Final test we automate in non-prod is User Acceptance Testing. </w:t>
+      </w:r>
+    </w:p>
+    <w:p>
+      <w:pPr>
+        <w:pStyle w:val="Normal"/>
+        <w:bidi w:val="0"/>
+        <w:jc w:val="start"/>
+        <w:rPr>
+          <w:i w:val="false"/>
+          <w:iCs w:val="false"/>
+        </w:rPr>
+      </w:pPr>
+      <w:r>
+        <w:rPr>
+          <w:i w:val="false"/>
+          <w:iCs w:val="false"/>
+        </w:rPr>
+        <w:t>All these tests helps us have confidence in moving code from non-prod to production</w:t>
+      </w:r>
+    </w:p>
+    <w:p>
+      <w:pPr>
+        <w:pStyle w:val="Normal"/>
+        <w:bidi w:val="0"/>
+        <w:jc w:val="start"/>
+        <w:rPr>
+          <w:i w:val="false"/>
+          <w:iCs w:val="false"/>
+        </w:rPr>
+      </w:pPr>
+      <w:r>
+        <w:rPr>
+          <w:i w:val="false"/>
+          <w:iCs w:val="false"/>
+        </w:rPr>
+        <w:t>We execute each of these suites of tests in every environment up to production</w:t>
+      </w:r>
+    </w:p>
+    <w:p>
+      <w:pPr>
+        <w:pStyle w:val="Normal"/>
+        <w:bidi w:val="0"/>
+        <w:jc w:val="start"/>
+        <w:rPr>
+          <w:i w:val="false"/>
+          <w:iCs w:val="false"/>
+        </w:rPr>
+      </w:pPr>
+      <w:r>
+        <w:rPr>
+          <w:i w:val="false"/>
+          <w:iCs w:val="false"/>
+        </w:rPr>
+      </w:r>
+    </w:p>
+    <w:p>
+      <w:pPr>
+        <w:pStyle w:val="Normal"/>
+        <w:bidi w:val="0"/>
+        <w:jc w:val="start"/>
+        <w:rPr>
+          <w:i w:val="false"/>
+          <w:iCs w:val="false"/>
+        </w:rPr>
+      </w:pPr>
+      <w:r>
+        <w:rPr>
+          <w:i w:val="false"/>
+          <w:iCs w:val="false"/>
+        </w:rPr>
+        <w:t>Once we get into production, we drop UAT, but CRON operation continually smoke tests the application. They all keep our confidence level high.</w:t>
+      </w:r>
+    </w:p>
+    <w:p>
+      <w:pPr>
+        <w:pStyle w:val="Normal"/>
+        <w:bidi w:val="0"/>
+        <w:jc w:val="start"/>
+        <w:rPr>
+          <w:i w:val="false"/>
+          <w:iCs w:val="false"/>
+        </w:rPr>
+      </w:pPr>
+      <w:r>
+        <w:rPr>
+          <w:i w:val="false"/>
+          <w:iCs w:val="false"/>
+        </w:rPr>
+        <w:t>CI/CD is a requirement of microservices more than anything</w:t>
+      </w:r>
+    </w:p>
+    <w:p>
+      <w:pPr>
+        <w:pStyle w:val="Normal"/>
+        <w:bidi w:val="0"/>
+        <w:jc w:val="start"/>
+        <w:rPr>
+          <w:i w:val="false"/>
+          <w:iCs w:val="false"/>
+        </w:rPr>
+      </w:pPr>
+      <w:r>
+        <w:rPr>
+          <w:i w:val="false"/>
+          <w:iCs w:val="false"/>
+        </w:rPr>
+      </w:r>
+    </w:p>
+    <w:p>
+      <w:pPr>
+        <w:pStyle w:val="Normal"/>
+        <w:bidi w:val="0"/>
+        <w:jc w:val="start"/>
+        <w:rPr>
+          <w:i w:val="false"/>
+          <w:iCs w:val="false"/>
+        </w:rPr>
+      </w:pPr>
+      <w:r>
+        <w:rPr>
+          <w:i w:val="false"/>
+          <w:iCs w:val="false"/>
+        </w:rPr>
+      </w:r>
+    </w:p>
+    <w:p>
+      <w:pPr>
+        <w:pStyle w:val="Normal"/>
+        <w:bidi w:val="0"/>
+        <w:jc w:val="start"/>
+        <w:rPr>
+          <w:i/>
+          <w:iCs/>
+        </w:rPr>
+      </w:pPr>
+      <w:r>
+        <w:rPr>
+          <w:i/>
+          <w:iCs/>
+        </w:rPr>
+        <w:t>Documentation:</w:t>
+      </w:r>
+    </w:p>
+    <w:p>
+      <w:pPr>
+        <w:pStyle w:val="Normal"/>
+        <w:bidi w:val="0"/>
+        <w:jc w:val="start"/>
+        <w:rPr>
+          <w:i w:val="false"/>
+          <w:iCs w:val="false"/>
+        </w:rPr>
+      </w:pPr>
+      <w:r>
+        <w:rPr>
+          <w:i w:val="false"/>
+          <w:iCs w:val="false"/>
+        </w:rPr>
+        <w:t>Your system may be written by multiple teams with very different focus areas, and having a solid documentation for your APIs can aid in the inter-team communication that will need to eventually happen. Great documentation can turn a stressful situation into a more collaborative event. Example for Restful Services, OpenAPI is a great tool (</w:t>
+      </w:r>
+      <w:hyperlink r:id="rId3">
+        <w:r>
+          <w:rPr>
+            <w:rStyle w:val="Hyperlink"/>
+            <w:i w:val="false"/>
+            <w:iCs w:val="false"/>
+          </w:rPr>
+          <w:t>https://www.openapis.org/</w:t>
+        </w:r>
+      </w:hyperlink>
+      <w:r>
+        <w:rPr>
+          <w:i w:val="false"/>
+          <w:iCs w:val="false"/>
+        </w:rPr>
+        <w:t xml:space="preserve">) for documenting API contracts. For OpenAPI that let you do both contract-first development (You define the API contract first, then generate or implement the code from it) and code-first development (You write the code first, then generate the API contract from the code). </w:t>
+      </w:r>
+    </w:p>
+    <w:p>
+      <w:pPr>
+        <w:pStyle w:val="Normal"/>
+        <w:bidi w:val="0"/>
+        <w:jc w:val="start"/>
+        <w:rPr>
+          <w:i w:val="false"/>
+          <w:iCs w:val="false"/>
+        </w:rPr>
+      </w:pPr>
+      <w:r>
+        <w:rPr>
+          <w:i w:val="false"/>
+          <w:iCs w:val="false"/>
+        </w:rPr>
+        <w:t>Documentation Sharing Strategy:</w:t>
+      </w:r>
+    </w:p>
+    <w:p>
+      <w:pPr>
+        <w:pStyle w:val="Normal"/>
+        <w:bidi w:val="0"/>
+        <w:jc w:val="start"/>
+        <w:rPr>
+          <w:i w:val="false"/>
+          <w:iCs w:val="false"/>
+        </w:rPr>
+      </w:pPr>
+      <w:r>
+        <w:rPr>
+          <w:i w:val="false"/>
+          <w:iCs w:val="false"/>
+        </w:rPr>
+        <w:t>Expose documentation as a consistent location (an HTTP Get request at a specific URL say ‘/docs’ will render an HTML documentation page). Check documentation framework. The key is, every API renders its documentation at the same URL.</w:t>
+      </w:r>
+    </w:p>
+    <w:p>
+      <w:pPr>
+        <w:pStyle w:val="Normal"/>
+        <w:bidi w:val="0"/>
+        <w:jc w:val="start"/>
+        <w:rPr>
+          <w:i w:val="false"/>
+          <w:iCs w:val="false"/>
+        </w:rPr>
+      </w:pPr>
+      <w:r>
+        <w:rPr>
+          <w:i w:val="false"/>
+          <w:iCs w:val="false"/>
+        </w:rPr>
+        <w:t>From there, we can populate central documentation repository</w:t>
+      </w:r>
+    </w:p>
+    <w:p>
+      <w:pPr>
+        <w:pStyle w:val="Normal"/>
+        <w:bidi w:val="0"/>
+        <w:jc w:val="start"/>
+        <w:rPr>
+          <w:i w:val="false"/>
+          <w:iCs w:val="false"/>
+        </w:rPr>
+      </w:pPr>
+      <w:r>
+        <w:rPr>
+          <w:i w:val="false"/>
+          <w:iCs w:val="false"/>
+        </w:rPr>
+        <w:t xml:space="preserve">You can build an automation tool that leverages tools like Service discovery, you can then get a collection of every service, and because they all expose docs at the same URL, you can crawl them and publish the documentation updates. </w:t>
+      </w:r>
+    </w:p>
+    <w:p>
+      <w:pPr>
+        <w:pStyle w:val="Normal"/>
+        <w:bidi w:val="0"/>
+        <w:jc w:val="start"/>
+        <w:rPr>
+          <w:i w:val="false"/>
+          <w:iCs w:val="false"/>
+        </w:rPr>
+      </w:pPr>
+      <w:r>
+        <w:rPr>
+          <w:i w:val="false"/>
+          <w:iCs w:val="false"/>
+        </w:rPr>
+        <w:t>Add examples of API consumption in your documentation, the user will know how to use the API</w:t>
+      </w:r>
+    </w:p>
+    <w:p>
+      <w:pPr>
+        <w:pStyle w:val="Normal"/>
+        <w:bidi w:val="0"/>
+        <w:jc w:val="start"/>
+        <w:rPr>
+          <w:i w:val="false"/>
+          <w:iCs w:val="false"/>
+        </w:rPr>
+      </w:pPr>
+      <w:r>
+        <w:rPr>
+          <w:i w:val="false"/>
+          <w:iCs w:val="false"/>
+        </w:rPr>
+        <w:t>Consider also publishing your team name and direct contacts within the documentation</w:t>
+      </w:r>
+    </w:p>
+    <w:p>
+      <w:pPr>
+        <w:pStyle w:val="Normal"/>
+        <w:bidi w:val="0"/>
+        <w:jc w:val="start"/>
+        <w:rPr>
+          <w:i w:val="false"/>
+          <w:iCs w:val="false"/>
+        </w:rPr>
+      </w:pPr>
+      <w:r>
+        <w:rPr>
+          <w:i w:val="false"/>
+          <w:iCs w:val="false"/>
+        </w:rPr>
+        <w:t>Solid documentation directly impacts operations, agility, and improve reuse of codes.</w:t>
+      </w:r>
+    </w:p>
+    <w:p>
+      <w:pPr>
+        <w:pStyle w:val="Normal"/>
+        <w:bidi w:val="0"/>
+        <w:jc w:val="start"/>
+        <w:rPr>
+          <w:i w:val="false"/>
+          <w:iCs w:val="false"/>
+        </w:rPr>
+      </w:pPr>
+      <w:r>
+        <w:rPr>
+          <w:i w:val="false"/>
+          <w:iCs w:val="false"/>
+        </w:rPr>
+        <w:t>Documentation changes should be part of your pull requests</w:t>
+      </w:r>
+    </w:p>
+    <w:p>
+      <w:pPr>
+        <w:pStyle w:val="Normal"/>
+        <w:bidi w:val="0"/>
+        <w:jc w:val="start"/>
+        <w:rPr>
+          <w:i w:val="false"/>
+          <w:iCs w:val="false"/>
+        </w:rPr>
+      </w:pPr>
+      <w:r>
+        <w:rPr>
+          <w:i w:val="false"/>
+          <w:iCs w:val="false"/>
+        </w:rPr>
+      </w:r>
+    </w:p>
+    <w:p>
+      <w:pPr>
+        <w:pStyle w:val="Normal"/>
+        <w:bidi w:val="0"/>
+        <w:jc w:val="start"/>
+        <w:rPr>
+          <w:i w:val="false"/>
+          <w:iCs w:val="false"/>
+        </w:rPr>
+      </w:pPr>
+      <w:r>
+        <w:rPr>
+          <w:i w:val="false"/>
+          <w:iCs w:val="false"/>
+        </w:rPr>
+      </w:r>
+    </w:p>
+    <w:p>
+      <w:pPr>
+        <w:pStyle w:val="Normal"/>
+        <w:bidi w:val="0"/>
+        <w:jc w:val="start"/>
+        <w:rPr>
+          <w:i w:val="false"/>
+          <w:iCs w:val="false"/>
+        </w:rPr>
+      </w:pPr>
+      <w:r>
+        <w:rPr>
+          <w:i w:val="false"/>
+          <w:iCs w:val="false"/>
+        </w:rPr>
+      </w:r>
+    </w:p>
+    <w:p>
+      <w:pPr>
+        <w:pStyle w:val="Normal"/>
+        <w:bidi w:val="0"/>
+        <w:jc w:val="start"/>
+        <w:rPr>
+          <w:i w:val="false"/>
+          <w:iCs w:val="false"/>
+        </w:rPr>
+      </w:pPr>
+      <w:r>
+        <w:rPr>
+          <w:i w:val="false"/>
+          <w:iCs w:val="false"/>
+        </w:rPr>
+        <w:t>Microservices DesignPatterns</w:t>
+      </w:r>
+    </w:p>
+    <w:p>
+      <w:pPr>
+        <w:pStyle w:val="Normal"/>
+        <w:bidi w:val="0"/>
+        <w:jc w:val="start"/>
+        <w:rPr>
+          <w:i w:val="false"/>
+          <w:iCs w:val="false"/>
+        </w:rPr>
+      </w:pPr>
+      <w:r>
+        <w:rPr>
+          <w:i w:val="false"/>
+          <w:iCs w:val="false"/>
+        </w:rPr>
+        <w:t>Decomposition patterns (breaking down monolith as well as defining some specific classes of services)</w:t>
+      </w:r>
+    </w:p>
+    <w:p>
+      <w:pPr>
+        <w:pStyle w:val="Normal"/>
+        <w:bidi w:val="0"/>
+        <w:jc w:val="start"/>
+        <w:rPr>
+          <w:i w:val="false"/>
+          <w:iCs w:val="false"/>
+        </w:rPr>
+      </w:pPr>
+      <w:r>
+        <w:rPr>
+          <w:i w:val="false"/>
+          <w:iCs w:val="false"/>
+        </w:rPr>
+        <w:t>Integration patterns for exposing APIs internally</w:t>
+      </w:r>
+    </w:p>
+    <w:p>
+      <w:pPr>
+        <w:pStyle w:val="Normal"/>
+        <w:bidi w:val="0"/>
+        <w:jc w:val="start"/>
+        <w:rPr>
+          <w:i w:val="false"/>
+          <w:iCs w:val="false"/>
+        </w:rPr>
+      </w:pPr>
+      <w:r>
+        <w:rPr>
+          <w:i w:val="false"/>
+          <w:iCs w:val="false"/>
+        </w:rPr>
+        <w:t>Data access patterns</w:t>
+      </w:r>
+    </w:p>
+    <w:p>
+      <w:pPr>
+        <w:pStyle w:val="Normal"/>
+        <w:bidi w:val="0"/>
+        <w:jc w:val="start"/>
+        <w:rPr>
+          <w:i w:val="false"/>
+          <w:iCs w:val="false"/>
+        </w:rPr>
+      </w:pPr>
+      <w:r>
+        <w:rPr>
+          <w:i w:val="false"/>
+          <w:iCs w:val="false"/>
+        </w:rPr>
+        <w:t>Operational patterns</w:t>
+      </w:r>
+    </w:p>
+    <w:p>
+      <w:pPr>
+        <w:pStyle w:val="Normal"/>
+        <w:bidi w:val="0"/>
+        <w:jc w:val="start"/>
+        <w:rPr>
+          <w:i w:val="false"/>
+          <w:iCs w:val="false"/>
+        </w:rPr>
+      </w:pPr>
+      <w:r>
+        <w:rPr>
+          <w:i w:val="false"/>
+          <w:iCs w:val="false"/>
+        </w:rPr>
+      </w:r>
+    </w:p>
+    <w:p>
+      <w:pPr>
+        <w:pStyle w:val="Normal"/>
+        <w:bidi w:val="0"/>
+        <w:jc w:val="start"/>
+        <w:rPr>
+          <w:i w:val="false"/>
+          <w:iCs w:val="false"/>
+        </w:rPr>
+      </w:pPr>
+      <w:r>
+        <w:rPr>
+          <w:i w:val="false"/>
+          <w:iCs w:val="false"/>
+        </w:rPr>
+      </w:r>
+    </w:p>
+    <w:p>
+      <w:pPr>
+        <w:pStyle w:val="Normal"/>
+        <w:bidi w:val="0"/>
+        <w:jc w:val="start"/>
+        <w:rPr>
+          <w:i w:val="false"/>
+          <w:iCs w:val="false"/>
+        </w:rPr>
+      </w:pPr>
+      <w:r>
+        <w:rPr>
+          <w:i w:val="false"/>
+          <w:iCs w:val="false"/>
+        </w:rPr>
+      </w:r>
+    </w:p>
+    <w:p>
+      <w:pPr>
+        <w:pStyle w:val="Normal"/>
+        <w:bidi w:val="0"/>
+        <w:jc w:val="start"/>
+        <w:rPr>
+          <w:i w:val="false"/>
+          <w:iCs w:val="false"/>
+        </w:rPr>
+      </w:pPr>
+      <w:r>
+        <w:rPr>
+          <w:i w:val="false"/>
+          <w:iCs w:val="false"/>
+        </w:rPr>
+      </w:r>
+    </w:p>
+    <w:p>
+      <w:pPr>
+        <w:pStyle w:val="Normal"/>
+        <w:bidi w:val="0"/>
+        <w:jc w:val="start"/>
+        <w:rPr>
+          <w:i w:val="false"/>
+          <w:iCs w:val="false"/>
+        </w:rPr>
+      </w:pPr>
+      <w:r>
+        <w:rPr>
+          <w:i w:val="false"/>
+          <w:iCs w:val="false"/>
+        </w:rPr>
+      </w:r>
+    </w:p>
+    <w:p>
+      <w:pPr>
+        <w:pStyle w:val="Normal"/>
+        <w:bidi w:val="0"/>
+        <w:jc w:val="start"/>
+        <w:rPr>
+          <w:i w:val="false"/>
+          <w:iCs w:val="false"/>
+        </w:rPr>
+      </w:pPr>
+      <w:r>
+        <w:rPr>
+          <w:i w:val="false"/>
+          <w:iCs w:val="false"/>
+        </w:rPr>
+      </w:r>
+    </w:p>
+    <w:p>
+      <w:pPr>
+        <w:pStyle w:val="Normal"/>
+        <w:bidi w:val="0"/>
+        <w:jc w:val="start"/>
+        <w:rPr>
+          <w:i w:val="false"/>
+          <w:iCs w:val="false"/>
+        </w:rPr>
+      </w:pPr>
+      <w:r>
+        <w:rPr>
+          <w:i w:val="false"/>
+          <w:iCs w:val="false"/>
+        </w:rPr>
+      </w:r>
+    </w:p>
+    <w:p>
+      <w:pPr>
+        <w:pStyle w:val="Normal"/>
+        <w:bidi w:val="0"/>
+        <w:jc w:val="start"/>
+        <w:rPr>
+          <w:i w:val="false"/>
+          <w:iCs w:val="false"/>
+        </w:rPr>
+      </w:pPr>
+      <w:r>
+        <w:rPr>
+          <w:i w:val="false"/>
+          <w:iCs w:val="false"/>
+        </w:rPr>
+      </w:r>
+    </w:p>
+    <w:p>
+      <w:pPr>
+        <w:pStyle w:val="Normal"/>
+        <w:bidi w:val="0"/>
+        <w:jc w:val="start"/>
+        <w:rPr>
+          <w:i w:val="false"/>
+          <w:iCs w:val="false"/>
+        </w:rPr>
+      </w:pPr>
+      <w:r>
+        <w:rPr>
+          <w:i w:val="false"/>
+          <w:iCs w:val="false"/>
+        </w:rPr>
+      </w:r>
+    </w:p>
+    <w:p>
+      <w:pPr>
+        <w:pStyle w:val="Normal"/>
+        <w:bidi w:val="0"/>
+        <w:jc w:val="start"/>
+        <w:rPr>
+          <w:i w:val="false"/>
+          <w:iCs w:val="false"/>
+        </w:rPr>
+      </w:pPr>
+      <w:r>
+        <w:rPr>
+          <w:i w:val="false"/>
+          <w:iCs w:val="false"/>
+        </w:rPr>
+      </w:r>
+    </w:p>
+    <w:p>
+      <w:pPr>
+        <w:pStyle w:val="Normal"/>
+        <w:bidi w:val="0"/>
+        <w:jc w:val="start"/>
+        <w:rPr>
+          <w:i w:val="false"/>
+          <w:iCs w:val="false"/>
+        </w:rPr>
+      </w:pPr>
+      <w:r>
+        <w:rPr>
+          <w:i w:val="false"/>
+          <w:iCs w:val="false"/>
+        </w:rPr>
+      </w:r>
+    </w:p>
+    <w:p>
+      <w:pPr>
+        <w:pStyle w:val="Normal"/>
+        <w:bidi w:val="0"/>
+        <w:jc w:val="start"/>
+        <w:rPr>
+          <w:i w:val="false"/>
+          <w:iCs w:val="false"/>
+        </w:rPr>
+      </w:pPr>
+      <w:r>
+        <w:rPr>
+          <w:i w:val="false"/>
+          <w:iCs w:val="false"/>
+        </w:rPr>
+      </w:r>
+    </w:p>
+    <w:p>
+      <w:pPr>
+        <w:pStyle w:val="Normal"/>
+        <w:bidi w:val="0"/>
+        <w:jc w:val="start"/>
+        <w:rPr>
+          <w:i w:val="false"/>
+          <w:iCs w:val="false"/>
+        </w:rPr>
+      </w:pPr>
+      <w:r>
+        <w:rPr>
+          <w:i w:val="false"/>
+          <w:iCs w:val="false"/>
+        </w:rPr>
+      </w:r>
+    </w:p>
+    <w:p>
+      <w:pPr>
+        <w:pStyle w:val="Normal"/>
+        <w:bidi w:val="0"/>
+        <w:jc w:val="start"/>
+        <w:rPr>
+          <w:i w:val="false"/>
+          <w:iCs w:val="false"/>
+        </w:rPr>
+      </w:pPr>
+      <w:r>
+        <w:rPr>
+          <w:i w:val="false"/>
+          <w:iCs w:val="false"/>
+        </w:rPr>
+      </w:r>
+    </w:p>
+    <w:p>
+      <w:pPr>
+        <w:pStyle w:val="Normal"/>
+        <w:bidi w:val="0"/>
+        <w:jc w:val="start"/>
+        <w:rPr>
+          <w:i w:val="false"/>
+          <w:iCs w:val="false"/>
+        </w:rPr>
+      </w:pPr>
+      <w:r>
+        <w:rPr>
+          <w:i w:val="false"/>
+          <w:iCs w:val="false"/>
+        </w:rPr>
+      </w:r>
+    </w:p>
+    <w:p>
+      <w:pPr>
+        <w:pStyle w:val="Normal"/>
+        <w:bidi w:val="0"/>
+        <w:jc w:val="start"/>
+        <w:rPr>
+          <w:i w:val="false"/>
+          <w:iCs w:val="false"/>
+        </w:rPr>
+      </w:pPr>
+      <w:r>
+        <w:rPr>
+          <w:i w:val="false"/>
+          <w:iCs w:val="false"/>
+        </w:rPr>
+      </w:r>
+    </w:p>
+    <w:p>
+      <w:pPr>
+        <w:pStyle w:val="Normal"/>
+        <w:bidi w:val="0"/>
+        <w:jc w:val="start"/>
+        <w:rPr>
+          <w:i w:val="false"/>
+          <w:iCs w:val="false"/>
+        </w:rPr>
+      </w:pPr>
+      <w:r>
+        <w:rPr>
+          <w:i w:val="false"/>
+          <w:iCs w:val="false"/>
+        </w:rPr>
         <w:t xml:space="preserve"> </w:t>
       </w:r>
     </w:p>
@@ -3353,602 +4097,6 @@
           <w:i w:val="false"/>
           <w:iCs w:val="false"/>
         </w:rPr>
-      </w:r>
-    </w:p>
-    <w:p>
-      <w:pPr>
-        <w:pStyle w:val="Normal"/>
-        <w:bidi w:val="0"/>
-        <w:jc w:val="start"/>
-        <w:rPr>
-          <w:i w:val="false"/>
-          <w:iCs w:val="false"/>
-        </w:rPr>
-      </w:pPr>
-      <w:r>
-        <w:rPr>
-          <w:i w:val="false"/>
-          <w:iCs w:val="false"/>
-        </w:rPr>
-        <w:t xml:space="preserve"> </w:t>
-      </w:r>
-    </w:p>
-    <w:p>
-      <w:pPr>
-        <w:pStyle w:val="Normal"/>
-        <w:bidi w:val="0"/>
-        <w:jc w:val="start"/>
-        <w:rPr>
-          <w:i w:val="false"/>
-          <w:iCs w:val="false"/>
-        </w:rPr>
-      </w:pPr>
-      <w:r>
-        <w:rPr>
-          <w:i w:val="false"/>
-          <w:iCs w:val="false"/>
-        </w:rPr>
-      </w:r>
-    </w:p>
-    <w:p>
-      <w:pPr>
-        <w:pStyle w:val="Normal"/>
-        <w:bidi w:val="0"/>
-        <w:jc w:val="start"/>
-        <w:rPr>
-          <w:i w:val="false"/>
-          <w:iCs w:val="false"/>
-        </w:rPr>
-      </w:pPr>
-      <w:r>
-        <w:rPr>
-          <w:i w:val="false"/>
-          <w:iCs w:val="false"/>
-        </w:rPr>
-      </w:r>
-    </w:p>
-    <w:p>
-      <w:pPr>
-        <w:pStyle w:val="Normal"/>
-        <w:bidi w:val="0"/>
-        <w:jc w:val="start"/>
-        <w:rPr>
-          <w:i w:val="false"/>
-          <w:iCs w:val="false"/>
-        </w:rPr>
-      </w:pPr>
-      <w:r>
-        <w:rPr>
-          <w:i w:val="false"/>
-          <w:iCs w:val="false"/>
-        </w:rPr>
-      </w:r>
-    </w:p>
-    <w:p>
-      <w:pPr>
-        <w:pStyle w:val="Normal"/>
-        <w:bidi w:val="0"/>
-        <w:jc w:val="start"/>
-        <w:rPr>
-          <w:i w:val="false"/>
-          <w:iCs w:val="false"/>
-        </w:rPr>
-      </w:pPr>
-      <w:r>
-        <w:rPr>
-          <w:i w:val="false"/>
-          <w:iCs w:val="false"/>
-        </w:rPr>
-      </w:r>
-    </w:p>
-    <w:p>
-      <w:pPr>
-        <w:pStyle w:val="Normal"/>
-        <w:bidi w:val="0"/>
-        <w:jc w:val="start"/>
-        <w:rPr>
-          <w:i w:val="false"/>
-          <w:iCs w:val="false"/>
-        </w:rPr>
-      </w:pPr>
-      <w:r>
-        <w:rPr>
-          <w:i w:val="false"/>
-          <w:iCs w:val="false"/>
-        </w:rPr>
-      </w:r>
-    </w:p>
-    <w:p>
-      <w:pPr>
-        <w:pStyle w:val="Normal"/>
-        <w:bidi w:val="0"/>
-        <w:jc w:val="start"/>
-        <w:rPr>
-          <w:i w:val="false"/>
-          <w:iCs w:val="false"/>
-        </w:rPr>
-      </w:pPr>
-      <w:r>
-        <w:rPr>
-          <w:i w:val="false"/>
-          <w:iCs w:val="false"/>
-        </w:rPr>
-      </w:r>
-    </w:p>
-    <w:p>
-      <w:pPr>
-        <w:pStyle w:val="Normal"/>
-        <w:bidi w:val="0"/>
-        <w:jc w:val="start"/>
-        <w:rPr>
-          <w:i w:val="false"/>
-          <w:iCs w:val="false"/>
-        </w:rPr>
-      </w:pPr>
-      <w:r>
-        <w:rPr>
-          <w:i w:val="false"/>
-          <w:iCs w:val="false"/>
-        </w:rPr>
-      </w:r>
-    </w:p>
-    <w:p>
-      <w:pPr>
-        <w:pStyle w:val="Normal"/>
-        <w:bidi w:val="0"/>
-        <w:jc w:val="start"/>
-        <w:rPr>
-          <w:i w:val="false"/>
-          <w:iCs w:val="false"/>
-        </w:rPr>
-      </w:pPr>
-      <w:r>
-        <w:rPr>
-          <w:i w:val="false"/>
-          <w:iCs w:val="false"/>
-        </w:rPr>
-      </w:r>
-    </w:p>
-    <w:p>
-      <w:pPr>
-        <w:pStyle w:val="Normal"/>
-        <w:bidi w:val="0"/>
-        <w:jc w:val="start"/>
-        <w:rPr>
-          <w:i w:val="false"/>
-          <w:iCs w:val="false"/>
-        </w:rPr>
-      </w:pPr>
-      <w:r>
-        <w:rPr>
-          <w:i w:val="false"/>
-          <w:iCs w:val="false"/>
-        </w:rPr>
-      </w:r>
-    </w:p>
-    <w:p>
-      <w:pPr>
-        <w:pStyle w:val="Normal"/>
-        <w:bidi w:val="0"/>
-        <w:jc w:val="start"/>
-        <w:rPr>
-          <w:i w:val="false"/>
-          <w:iCs w:val="false"/>
-        </w:rPr>
-      </w:pPr>
-      <w:r>
-        <w:rPr>
-          <w:i w:val="false"/>
-          <w:iCs w:val="false"/>
-        </w:rPr>
-      </w:r>
-    </w:p>
-    <w:p>
-      <w:pPr>
-        <w:pStyle w:val="Normal"/>
-        <w:bidi w:val="0"/>
-        <w:jc w:val="start"/>
-        <w:rPr>
-          <w:i w:val="false"/>
-          <w:iCs w:val="false"/>
-        </w:rPr>
-      </w:pPr>
-      <w:r>
-        <w:rPr>
-          <w:i w:val="false"/>
-          <w:iCs w:val="false"/>
-        </w:rPr>
-      </w:r>
-    </w:p>
-    <w:p>
-      <w:pPr>
-        <w:pStyle w:val="Normal"/>
-        <w:bidi w:val="0"/>
-        <w:jc w:val="start"/>
-        <w:rPr>
-          <w:i w:val="false"/>
-          <w:iCs w:val="false"/>
-        </w:rPr>
-      </w:pPr>
-      <w:r>
-        <w:rPr>
-          <w:i w:val="false"/>
-          <w:iCs w:val="false"/>
-        </w:rPr>
-      </w:r>
-    </w:p>
-    <w:p>
-      <w:pPr>
-        <w:pStyle w:val="Normal"/>
-        <w:bidi w:val="0"/>
-        <w:jc w:val="start"/>
-        <w:rPr>
-          <w:i w:val="false"/>
-          <w:iCs w:val="false"/>
-        </w:rPr>
-      </w:pPr>
-      <w:r>
-        <w:rPr>
-          <w:i w:val="false"/>
-          <w:iCs w:val="false"/>
-        </w:rPr>
-      </w:r>
-    </w:p>
-    <w:p>
-      <w:pPr>
-        <w:pStyle w:val="Normal"/>
-        <w:bidi w:val="0"/>
-        <w:jc w:val="start"/>
-        <w:rPr>
-          <w:i w:val="false"/>
-          <w:iCs w:val="false"/>
-        </w:rPr>
-      </w:pPr>
-      <w:r>
-        <w:rPr>
-          <w:i w:val="false"/>
-          <w:iCs w:val="false"/>
-        </w:rPr>
-      </w:r>
-    </w:p>
-    <w:p>
-      <w:pPr>
-        <w:pStyle w:val="Normal"/>
-        <w:bidi w:val="0"/>
-        <w:jc w:val="start"/>
-        <w:rPr>
-          <w:i w:val="false"/>
-          <w:iCs w:val="false"/>
-        </w:rPr>
-      </w:pPr>
-      <w:r>
-        <w:rPr>
-          <w:i w:val="false"/>
-          <w:iCs w:val="false"/>
-        </w:rPr>
-      </w:r>
-    </w:p>
-    <w:p>
-      <w:pPr>
-        <w:pStyle w:val="Normal"/>
-        <w:bidi w:val="0"/>
-        <w:jc w:val="start"/>
-        <w:rPr>
-          <w:i w:val="false"/>
-          <w:iCs w:val="false"/>
-        </w:rPr>
-      </w:pPr>
-      <w:r>
-        <w:rPr>
-          <w:i w:val="false"/>
-          <w:iCs w:val="false"/>
-        </w:rPr>
-      </w:r>
-    </w:p>
-    <w:p>
-      <w:pPr>
-        <w:pStyle w:val="Normal"/>
-        <w:bidi w:val="0"/>
-        <w:jc w:val="start"/>
-        <w:rPr>
-          <w:i w:val="false"/>
-          <w:iCs w:val="false"/>
-        </w:rPr>
-      </w:pPr>
-      <w:r>
-        <w:rPr>
-          <w:i w:val="false"/>
-          <w:iCs w:val="false"/>
-        </w:rPr>
-      </w:r>
-    </w:p>
-    <w:p>
-      <w:pPr>
-        <w:pStyle w:val="Normal"/>
-        <w:bidi w:val="0"/>
-        <w:jc w:val="start"/>
-        <w:rPr>
-          <w:i w:val="false"/>
-          <w:iCs w:val="false"/>
-        </w:rPr>
-      </w:pPr>
-      <w:r>
-        <w:rPr>
-          <w:i w:val="false"/>
-          <w:iCs w:val="false"/>
-        </w:rPr>
-      </w:r>
-    </w:p>
-    <w:p>
-      <w:pPr>
-        <w:pStyle w:val="Normal"/>
-        <w:bidi w:val="0"/>
-        <w:jc w:val="start"/>
-        <w:rPr>
-          <w:i w:val="false"/>
-          <w:iCs w:val="false"/>
-        </w:rPr>
-      </w:pPr>
-      <w:r>
-        <w:rPr>
-          <w:i w:val="false"/>
-          <w:iCs w:val="false"/>
-        </w:rPr>
-      </w:r>
-    </w:p>
-    <w:p>
-      <w:pPr>
-        <w:pStyle w:val="Normal"/>
-        <w:bidi w:val="0"/>
-        <w:jc w:val="start"/>
-        <w:rPr>
-          <w:i w:val="false"/>
-          <w:iCs w:val="false"/>
-        </w:rPr>
-      </w:pPr>
-      <w:r>
-        <w:rPr>
-          <w:i w:val="false"/>
-          <w:iCs w:val="false"/>
-        </w:rPr>
-      </w:r>
-    </w:p>
-    <w:p>
-      <w:pPr>
-        <w:pStyle w:val="Normal"/>
-        <w:bidi w:val="0"/>
-        <w:jc w:val="start"/>
-        <w:rPr>
-          <w:i w:val="false"/>
-          <w:iCs w:val="false"/>
-        </w:rPr>
-      </w:pPr>
-      <w:r>
-        <w:rPr>
-          <w:i w:val="false"/>
-          <w:iCs w:val="false"/>
-        </w:rPr>
-      </w:r>
-    </w:p>
-    <w:p>
-      <w:pPr>
-        <w:pStyle w:val="Normal"/>
-        <w:bidi w:val="0"/>
-        <w:jc w:val="start"/>
-        <w:rPr>
-          <w:i w:val="false"/>
-          <w:iCs w:val="false"/>
-        </w:rPr>
-      </w:pPr>
-      <w:r>
-        <w:rPr>
-          <w:i w:val="false"/>
-          <w:iCs w:val="false"/>
-        </w:rPr>
-      </w:r>
-    </w:p>
-    <w:p>
-      <w:pPr>
-        <w:pStyle w:val="Normal"/>
-        <w:bidi w:val="0"/>
-        <w:jc w:val="start"/>
-        <w:rPr>
-          <w:i/>
-          <w:iCs/>
-        </w:rPr>
-      </w:pPr>
-      <w:r>
-        <w:rPr>
-          <w:i/>
-          <w:iCs/>
-        </w:rPr>
-      </w:r>
-    </w:p>
-    <w:p>
-      <w:pPr>
-        <w:pStyle w:val="Normal"/>
-        <w:bidi w:val="0"/>
-        <w:jc w:val="start"/>
-        <w:rPr/>
-      </w:pPr>
-      <w:r>
-        <w:rPr/>
-      </w:r>
-    </w:p>
-    <w:p>
-      <w:pPr>
-        <w:pStyle w:val="Normal"/>
-        <w:bidi w:val="0"/>
-        <w:jc w:val="start"/>
-        <w:rPr/>
-      </w:pPr>
-      <w:r>
-        <w:rPr/>
-      </w:r>
-    </w:p>
-    <w:p>
-      <w:pPr>
-        <w:pStyle w:val="Normal"/>
-        <w:bidi w:val="0"/>
-        <w:jc w:val="start"/>
-        <w:rPr/>
-      </w:pPr>
-      <w:r>
-        <w:rPr/>
-      </w:r>
-    </w:p>
-    <w:p>
-      <w:pPr>
-        <w:pStyle w:val="Normal"/>
-        <w:bidi w:val="0"/>
-        <w:jc w:val="start"/>
-        <w:rPr/>
-      </w:pPr>
-      <w:r>
-        <w:rPr/>
-      </w:r>
-    </w:p>
-    <w:p>
-      <w:pPr>
-        <w:pStyle w:val="Normal"/>
-        <w:bidi w:val="0"/>
-        <w:jc w:val="start"/>
-        <w:rPr/>
-      </w:pPr>
-      <w:r>
-        <w:rPr/>
-      </w:r>
-    </w:p>
-    <w:p>
-      <w:pPr>
-        <w:pStyle w:val="Normal"/>
-        <w:bidi w:val="0"/>
-        <w:jc w:val="start"/>
-        <w:rPr/>
-      </w:pPr>
-      <w:r>
-        <w:rPr/>
-      </w:r>
-    </w:p>
-    <w:p>
-      <w:pPr>
-        <w:pStyle w:val="Normal"/>
-        <w:bidi w:val="0"/>
-        <w:jc w:val="start"/>
-        <w:rPr/>
-      </w:pPr>
-      <w:r>
-        <w:rPr/>
-      </w:r>
-    </w:p>
-    <w:p>
-      <w:pPr>
-        <w:pStyle w:val="Normal"/>
-        <w:bidi w:val="0"/>
-        <w:jc w:val="start"/>
-        <w:rPr/>
-      </w:pPr>
-      <w:r>
-        <w:rPr/>
-      </w:r>
-    </w:p>
-    <w:p>
-      <w:pPr>
-        <w:pStyle w:val="Normal"/>
-        <w:bidi w:val="0"/>
-        <w:jc w:val="start"/>
-        <w:rPr/>
-      </w:pPr>
-      <w:r>
-        <w:rPr/>
-      </w:r>
-    </w:p>
-    <w:p>
-      <w:pPr>
-        <w:pStyle w:val="Normal"/>
-        <w:bidi w:val="0"/>
-        <w:jc w:val="start"/>
-        <w:rPr/>
-      </w:pPr>
-      <w:r>
-        <w:rPr/>
-      </w:r>
-    </w:p>
-    <w:p>
-      <w:pPr>
-        <w:pStyle w:val="Normal"/>
-        <w:bidi w:val="0"/>
-        <w:jc w:val="start"/>
-        <w:rPr/>
-      </w:pPr>
-      <w:r>
-        <w:rPr/>
-      </w:r>
-    </w:p>
-    <w:p>
-      <w:pPr>
-        <w:pStyle w:val="Normal"/>
-        <w:bidi w:val="0"/>
-        <w:jc w:val="start"/>
-        <w:rPr/>
-      </w:pPr>
-      <w:r>
-        <w:rPr/>
-      </w:r>
-    </w:p>
-    <w:p>
-      <w:pPr>
-        <w:pStyle w:val="Normal"/>
-        <w:bidi w:val="0"/>
-        <w:jc w:val="start"/>
-        <w:rPr/>
-      </w:pPr>
-      <w:r>
-        <w:rPr/>
-      </w:r>
-    </w:p>
-    <w:p>
-      <w:pPr>
-        <w:pStyle w:val="Normal"/>
-        <w:bidi w:val="0"/>
-        <w:jc w:val="start"/>
-        <w:rPr/>
-      </w:pPr>
-      <w:r>
-        <w:rPr/>
-      </w:r>
-    </w:p>
-    <w:p>
-      <w:pPr>
-        <w:pStyle w:val="Normal"/>
-        <w:bidi w:val="0"/>
-        <w:jc w:val="start"/>
-        <w:rPr/>
-      </w:pPr>
-      <w:r>
-        <w:rPr/>
-      </w:r>
-    </w:p>
-    <w:p>
-      <w:pPr>
-        <w:pStyle w:val="Normal"/>
-        <w:bidi w:val="0"/>
-        <w:jc w:val="start"/>
-        <w:rPr/>
-      </w:pPr>
-      <w:r>
-        <w:rPr/>
-      </w:r>
-    </w:p>
-    <w:p>
-      <w:pPr>
-        <w:pStyle w:val="Normal"/>
-        <w:bidi w:val="0"/>
-        <w:jc w:val="start"/>
-        <w:rPr/>
-      </w:pPr>
-      <w:r>
-        <w:rPr/>
       </w:r>
     </w:p>
     <w:sectPr>

</xml_diff>